<commit_message>
fix: final SOT header cleanup
</commit_message>
<xml_diff>
--- a/MITHQAL_MASTER_BLUEPRINT_SOT.docx
+++ b/MITHQAL_MASTER_BLUEPRINT_SOT.docx
@@ -21,13 +21,13 @@
       </w:r>
     </w:p>
     <w:bookmarkEnd w:id="20"/>
-    <w:bookmarkStart w:id="21" w:name="X098cc953b57f015a12cadc30b153e3f49801c67"/>
+    <w:bookmarkStart w:id="21" w:name="X4a6fbf53671b9b9699132c73804a1fe3dedb720"/>
     <w:p>
       <w:pPr>
         <w:pStyle w:val="Heading2"/>
       </w:pPr>
       <w:r>
-        <w:t xml:space="preserve">No older versions are referenced. This IS the architecture., Reconciliation &amp; Final Consolidation</w:t>
+        <w:t xml:space="preserve">THE SINGLE AUTHORITATIVE SOURCE OF TRUTH — This IS the architecture.</w:t>
       </w:r>
     </w:p>
     <w:bookmarkEnd w:id="21"/>

</xml_diff>